<commit_message>
Reading copies: build script, figure captions printed once, 6.5 slot markup fixed; full copy rebuilt
Co-Authored-By: Claude Opus 5.5 <noreply@anthropic.com>
Claude-Session: https://claude.ai/code/session_01XxH9J9TaLYfAYFCaGAqS9y
</commit_message>
<xml_diff>
--- a/papers/thesis_2026-10/reading/thesis_compact_2026-10-15.docx
+++ b/papers/thesis_2026-10/reading/thesis_compact_2026-10-15.docx
@@ -63,19 +63,7 @@
         <w:pStyle w:val="Subtitle"/>
       </w:pPr>
       <w:r>
-        <w:t xml:space="preserve">15</w:t>
-      </w:r>
-      <w:r>
-        <w:t xml:space="preserve"> </w:t>
-      </w:r>
-      <w:r>
-        <w:t xml:space="preserve">October</w:t>
-      </w:r>
-      <w:r>
-        <w:t xml:space="preserve"> </w:t>
-      </w:r>
-      <w:r>
-        <w:t xml:space="preserve">2026.</w:t>
+        <w:t xml:space="preserve">2026-10-15.</w:t>
       </w:r>
       <w:r>
         <w:t xml:space="preserve"> </w:t>
@@ -820,14 +808,14 @@
     </w:p>
     <w:p>
       <w:pPr>
-        <w:pStyle w:val="CaptionedFigure"/>
+        <w:pStyle w:val="BodyText"/>
       </w:pPr>
       <w:r>
         <w:drawing>
           <wp:inline>
             <wp:extent cx="5302908" cy="2896109"/>
             <wp:effectExtent b="0" l="0" r="0" t="0"/>
-            <wp:docPr descr="Figure 3.1" title="" id="30" name="Picture"/>
+            <wp:docPr descr="" title="" id="30" name="Picture"/>
             <a:graphic>
               <a:graphicData uri="http://schemas.openxmlformats.org/drawingml/2006/picture">
                 <pic:pic>
@@ -867,14 +855,6 @@
     </w:p>
     <w:p>
       <w:pPr>
-        <w:pStyle w:val="ImageCaption"/>
-      </w:pPr>
-      <w:r>
-        <w:t xml:space="preserve">Figure 3.1</w:t>
-      </w:r>
-    </w:p>
-    <w:p>
-      <w:pPr>
         <w:pStyle w:val="BodyText"/>
       </w:pPr>
       <w:r>
@@ -5813,14 +5793,14 @@
     </w:p>
     <w:p>
       <w:pPr>
-        <w:pStyle w:val="CaptionedFigure"/>
+        <w:pStyle w:val="BodyText"/>
       </w:pPr>
       <w:r>
         <w:drawing>
           <wp:inline>
             <wp:extent cx="6400800" cy="2358031"/>
             <wp:effectExtent b="0" l="0" r="0" t="0"/>
-            <wp:docPr descr="Figure 5.1" title="" id="52" name="Picture"/>
+            <wp:docPr descr="" title="" id="52" name="Picture"/>
             <a:graphic>
               <a:graphicData uri="http://schemas.openxmlformats.org/drawingml/2006/picture">
                 <pic:pic>
@@ -5860,14 +5840,6 @@
     </w:p>
     <w:p>
       <w:pPr>
-        <w:pStyle w:val="ImageCaption"/>
-      </w:pPr>
-      <w:r>
-        <w:t xml:space="preserve">Figure 5.1</w:t>
-      </w:r>
-    </w:p>
-    <w:p>
-      <w:pPr>
         <w:pStyle w:val="BodyText"/>
       </w:pPr>
       <w:r>
@@ -6472,14 +6444,14 @@
     </w:p>
     <w:p>
       <w:pPr>
-        <w:pStyle w:val="CaptionedFigure"/>
+        <w:pStyle w:val="BodyText"/>
       </w:pPr>
       <w:r>
         <w:drawing>
           <wp:inline>
             <wp:extent cx="6400800" cy="2166333"/>
             <wp:effectExtent b="0" l="0" r="0" t="0"/>
-            <wp:docPr descr="Figure 5.2" title="" id="56" name="Picture"/>
+            <wp:docPr descr="" title="" id="56" name="Picture"/>
             <a:graphic>
               <a:graphicData uri="http://schemas.openxmlformats.org/drawingml/2006/picture">
                 <pic:pic>
@@ -6519,14 +6491,6 @@
     </w:p>
     <w:p>
       <w:pPr>
-        <w:pStyle w:val="ImageCaption"/>
-      </w:pPr>
-      <w:r>
-        <w:t xml:space="preserve">Figure 5.2</w:t>
-      </w:r>
-    </w:p>
-    <w:p>
-      <w:pPr>
         <w:pStyle w:val="BodyText"/>
       </w:pPr>
       <w:r>
@@ -6621,14 +6585,14 @@
     </w:p>
     <w:p>
       <w:pPr>
-        <w:pStyle w:val="CaptionedFigure"/>
+        <w:pStyle w:val="BodyText"/>
       </w:pPr>
       <w:r>
         <w:drawing>
           <wp:inline>
             <wp:extent cx="6400800" cy="3435305"/>
             <wp:effectExtent b="0" l="0" r="0" t="0"/>
-            <wp:docPr descr="Figure 5.3" title="" id="61" name="Picture"/>
+            <wp:docPr descr="" title="" id="61" name="Picture"/>
             <a:graphic>
               <a:graphicData uri="http://schemas.openxmlformats.org/drawingml/2006/picture">
                 <pic:pic>
@@ -6668,14 +6632,6 @@
     </w:p>
     <w:p>
       <w:pPr>
-        <w:pStyle w:val="ImageCaption"/>
-      </w:pPr>
-      <w:r>
-        <w:t xml:space="preserve">Figure 5.3</w:t>
-      </w:r>
-    </w:p>
-    <w:p>
-      <w:pPr>
         <w:pStyle w:val="BodyText"/>
       </w:pPr>
       <w:r>
@@ -7034,14 +6990,14 @@
     </w:p>
     <w:p>
       <w:pPr>
-        <w:pStyle w:val="CaptionedFigure"/>
+        <w:pStyle w:val="BodyText"/>
       </w:pPr>
       <w:r>
         <w:drawing>
           <wp:inline>
             <wp:extent cx="6400800" cy="2540569"/>
             <wp:effectExtent b="0" l="0" r="0" t="0"/>
-            <wp:docPr descr="Figure 5.4" title="" id="67" name="Picture"/>
+            <wp:docPr descr="" title="" id="67" name="Picture"/>
             <a:graphic>
               <a:graphicData uri="http://schemas.openxmlformats.org/drawingml/2006/picture">
                 <pic:pic>
@@ -7081,14 +7037,6 @@
     </w:p>
     <w:p>
       <w:pPr>
-        <w:pStyle w:val="ImageCaption"/>
-      </w:pPr>
-      <w:r>
-        <w:t xml:space="preserve">Figure 5.4</w:t>
-      </w:r>
-    </w:p>
-    <w:p>
-      <w:pPr>
         <w:pStyle w:val="BodyText"/>
       </w:pPr>
       <w:r>
@@ -7181,14 +7129,14 @@
     </w:p>
     <w:p>
       <w:pPr>
-        <w:pStyle w:val="CaptionedFigure"/>
+        <w:pStyle w:val="BodyText"/>
       </w:pPr>
       <w:r>
         <w:drawing>
           <wp:inline>
             <wp:extent cx="5513923" cy="2639221"/>
             <wp:effectExtent b="0" l="0" r="0" t="0"/>
-            <wp:docPr descr="Figure 5.5" title="" id="71" name="Picture"/>
+            <wp:docPr descr="" title="" id="71" name="Picture"/>
             <a:graphic>
               <a:graphicData uri="http://schemas.openxmlformats.org/drawingml/2006/picture">
                 <pic:pic>
@@ -7228,14 +7176,6 @@
     </w:p>
     <w:p>
       <w:pPr>
-        <w:pStyle w:val="ImageCaption"/>
-      </w:pPr>
-      <w:r>
-        <w:t xml:space="preserve">Figure 5.5</w:t>
-      </w:r>
-    </w:p>
-    <w:p>
-      <w:pPr>
         <w:pStyle w:val="BodyText"/>
       </w:pPr>
       <w:r>
@@ -8905,7 +8845,13 @@
           <w:bCs/>
           <w:b/>
         </w:rPr>
-        <w:t xml:space="preserve">[Results slot.** To be written after the GoTo results (late October), the BPS national accounts (early November) and the Grab and Sea results (mid-November). For each outcome: the result against its range in Table 6.2 and Appendix C, then one paragraph on what the outcomes show about the cap and one on marketplace fees.**]</w:t>
+        <w:t xml:space="preserve">[Results slot]</w:t>
+      </w:r>
+      <w:r>
+        <w:t xml:space="preserve"> </w:t>
+      </w:r>
+      <w:r>
+        <w:t xml:space="preserve">To be written after the GoTo results (late October), the BPS national accounts (early November) and the Grab and Sea results (mid-November). For each outcome: the result against its range in Table 6.2 and Appendix C, then one paragraph on what the outcomes show about the cap and one on marketplace fees.</w:t>
       </w:r>
     </w:p>
     <w:p>

</xml_diff>